<commit_message>
style(manuscript): Palatino Linotype throughout and 9 pt tables in the Word output
patch_reference_docx.py sets the theme and default fonts of both Word reference
documents to Palatino Linotype and gives the "Table" table style 9 pt text, so
only table cells shrink. Idempotent.

Co-Authored-By: Claude Opus 5.5 <noreply@anthropic.com>
</commit_message>
<xml_diff>
--- a/Manuscript/custom-reference.docx
+++ b/Manuscript/custom-reference.docx
@@ -499,7 +499,7 @@
   <w:docDefaults>
     <w:rPrDefault>
       <w:rPr>
-        <w:rFonts w:asciiTheme="minorHAnsi" w:eastAsiaTheme="minorEastAsia" w:hAnsiTheme="minorHAnsi" w:cstheme="minorBidi"/>
+        <w:rFonts w:cs="Palatino Linotype" w:hAnsi="Palatino Linotype" w:ascii="Palatino Linotype" w:asciiTheme="minorHAnsi" w:eastAsiaTheme="minorEastAsia" w:hAnsiTheme="minorHAnsi" w:cstheme="minorBidi"/>
         <w:sz w:val="24"/>
         <w:szCs w:val="24"/>
         <w:lang w:val="en-US" w:eastAsia="zh-CN" w:bidi="ar-SA"/>
@@ -1033,6 +1033,10 @@
     <w:semiHidden/>
     <w:unhideWhenUsed/>
     <w:qFormat/>
+    <w:rPr>
+      <w:sz w:val="18"/>
+      <w:szCs w:val="18"/>
+    </w:rPr>
     <w:tblPr>
       <w:tblInd w:w="0" w:type="dxa"/>
       <w:tblCellMar>
@@ -1196,7 +1200,7 @@
     </a:clrScheme>
     <a:fontScheme name="Office">
       <a:majorFont>
-        <a:latin typeface="Aptos Display" panose="02110004020202020204"/>
+        <a:latin typeface="Palatino Linotype" panose="02110004020202020204"/>
         <a:ea typeface=""/>
         <a:cs typeface=""/>
         <a:font script="Jpan" typeface="游ゴシック Light"/>
@@ -1248,7 +1252,7 @@
         <a:font script="Tfng" typeface="Ebrima"/>
       </a:majorFont>
       <a:minorFont>
-        <a:latin typeface="Aptos" panose="02110004020202020204"/>
+        <a:latin typeface="Palatino Linotype" panose="02110004020202020204"/>
         <a:ea typeface=""/>
         <a:cs typeface=""/>
         <a:font script="Jpan" typeface="游明朝"/>

</xml_diff>